<commit_message>
Added Github Repo Link
</commit_message>
<xml_diff>
--- a/Reflection.docx
+++ b/Reflection.docx
@@ -7,8 +7,8 @@
         <w:pStyle w:val="Normal"/>
         <w:rPr>
           <w:rFonts w:ascii="Aptos" w:hAnsi="Aptos" w:eastAsia="Aptos" w:cs="Aptos" w:asciiTheme="minorAscii" w:hAnsiTheme="minorAscii" w:eastAsiaTheme="minorAscii" w:cstheme="minorAscii"/>
-          <w:b w:val="1"/>
-          <w:bCs w:val="1"/>
+          <w:b w:val="0"/>
+          <w:bCs w:val="0"/>
           <w:i w:val="0"/>
           <w:iCs w:val="0"/>
           <w:caps w:val="0"/>
@@ -19,15 +19,15 @@
           <w:color w:val="auto"/>
           <w:sz w:val="40"/>
           <w:szCs w:val="40"/>
-          <w:u w:val="single"/>
+          <w:u w:val="none"/>
           <w:lang w:val="en-GB"/>
         </w:rPr>
       </w:pPr>
       <w:r>
         <w:rPr>
           <w:rFonts w:ascii="Aptos" w:hAnsi="Aptos" w:eastAsia="Aptos" w:cs="Aptos" w:asciiTheme="minorAscii" w:hAnsiTheme="minorAscii" w:eastAsiaTheme="minorAscii" w:cstheme="minorAscii"/>
-          <w:b w:val="1"/>
-          <w:bCs w:val="1"/>
+          <w:b w:val="0"/>
+          <w:bCs w:val="0"/>
           <w:i w:val="0"/>
           <w:iCs w:val="0"/>
           <w:caps w:val="0"/>
@@ -38,93 +38,54 @@
           <w:color w:val="auto"/>
           <w:sz w:val="40"/>
           <w:szCs w:val="40"/>
-          <w:u w:val="single"/>
-          <w:lang w:val="en-GB"/>
-        </w:rPr>
-        <w:t>Reflection – What were my expectations?</w:t>
-      </w:r>
+          <w:u w:val="none"/>
+          <w:lang w:val="en-GB"/>
+        </w:rPr>
+        <w:t xml:space="preserve">Checklist said to put this here </w:t>
+      </w:r>
+      <w:hyperlink r:id="R5098d0b1b5d44a22">
+        <w:r>
+          <w:rPr>
+            <w:rStyle w:val="Hyperlink"/>
+            <w:rFonts w:ascii="Aptos" w:hAnsi="Aptos" w:eastAsia="Aptos" w:cs="Aptos" w:asciiTheme="minorAscii" w:hAnsiTheme="minorAscii" w:eastAsiaTheme="minorAscii" w:cstheme="minorAscii"/>
+            <w:b w:val="0"/>
+            <w:bCs w:val="0"/>
+            <w:i w:val="0"/>
+            <w:iCs w:val="0"/>
+            <w:caps w:val="0"/>
+            <w:smallCaps w:val="0"/>
+            <w:strike w:val="0"/>
+            <w:dstrike w:val="0"/>
+            <w:noProof w:val="0"/>
+            <w:sz w:val="40"/>
+            <w:szCs w:val="40"/>
+            <w:lang w:val="en-GB"/>
+          </w:rPr>
+          <w:t>Github</w:t>
+        </w:r>
+      </w:hyperlink>
     </w:p>
     <w:p>
       <w:pPr>
         <w:pStyle w:val="Normal"/>
         <w:rPr>
           <w:rFonts w:ascii="Aptos" w:hAnsi="Aptos" w:eastAsia="Aptos" w:cs="Aptos" w:asciiTheme="minorAscii" w:hAnsiTheme="minorAscii" w:eastAsiaTheme="minorAscii" w:cstheme="minorAscii"/>
-          <w:b w:val="0"/>
-          <w:bCs w:val="0"/>
-          <w:i w:val="0"/>
-          <w:iCs w:val="0"/>
-          <w:caps w:val="0"/>
-          <w:smallCaps w:val="0"/>
-          <w:strike w:val="0"/>
-          <w:dstrike w:val="0"/>
-          <w:noProof w:val="0"/>
-          <w:color w:val="auto"/>
-          <w:sz w:val="32"/>
-          <w:szCs w:val="32"/>
-          <w:u w:val="none"/>
+          <w:b w:val="1"/>
+          <w:bCs w:val="1"/>
+          <w:i w:val="0"/>
+          <w:iCs w:val="0"/>
+          <w:caps w:val="0"/>
+          <w:smallCaps w:val="0"/>
+          <w:strike w:val="0"/>
+          <w:dstrike w:val="0"/>
+          <w:noProof w:val="0"/>
+          <w:color w:val="auto"/>
+          <w:sz w:val="40"/>
+          <w:szCs w:val="40"/>
+          <w:u w:val="single"/>
           <w:lang w:val="en-GB"/>
         </w:rPr>
       </w:pPr>
-      <w:r>
-        <w:rPr>
-          <w:rFonts w:ascii="Aptos" w:hAnsi="Aptos" w:eastAsia="Aptos" w:cs="Aptos" w:asciiTheme="minorAscii" w:hAnsiTheme="minorAscii" w:eastAsiaTheme="minorAscii" w:cstheme="minorAscii"/>
-          <w:b w:val="0"/>
-          <w:bCs w:val="0"/>
-          <w:i w:val="0"/>
-          <w:iCs w:val="0"/>
-          <w:caps w:val="0"/>
-          <w:smallCaps w:val="0"/>
-          <w:strike w:val="0"/>
-          <w:dstrike w:val="0"/>
-          <w:noProof w:val="0"/>
-          <w:color w:val="auto"/>
-          <w:sz w:val="32"/>
-          <w:szCs w:val="32"/>
-          <w:u w:val="none"/>
-          <w:lang w:val="en-GB"/>
-        </w:rPr>
-        <w:t xml:space="preserve">To be honest I was not expecting this module to be as difficult as it was, with prior coding knowledge from other game engines I wrongfully assumed that C++ would be incredibly similar, but through the whole experience I continuously ran into </w:t>
-      </w:r>
-      <w:r>
-        <w:rPr>
-          <w:rFonts w:ascii="Aptos" w:hAnsi="Aptos" w:eastAsia="Aptos" w:cs="Aptos" w:asciiTheme="minorAscii" w:hAnsiTheme="minorAscii" w:eastAsiaTheme="minorAscii" w:cstheme="minorAscii"/>
-          <w:b w:val="0"/>
-          <w:bCs w:val="0"/>
-          <w:i w:val="0"/>
-          <w:iCs w:val="0"/>
-          <w:caps w:val="0"/>
-          <w:smallCaps w:val="0"/>
-          <w:strike w:val="0"/>
-          <w:dstrike w:val="0"/>
-          <w:noProof w:val="0"/>
-          <w:color w:val="auto"/>
-          <w:sz w:val="32"/>
-          <w:szCs w:val="32"/>
-          <w:u w:val="none"/>
-          <w:lang w:val="en-GB"/>
-        </w:rPr>
-        <w:t>problems with</w:t>
-      </w:r>
-      <w:r>
-        <w:rPr>
-          <w:rFonts w:ascii="Aptos" w:hAnsi="Aptos" w:eastAsia="Aptos" w:cs="Aptos" w:asciiTheme="minorAscii" w:hAnsiTheme="minorAscii" w:eastAsiaTheme="minorAscii" w:cstheme="minorAscii"/>
-          <w:b w:val="0"/>
-          <w:bCs w:val="0"/>
-          <w:i w:val="0"/>
-          <w:iCs w:val="0"/>
-          <w:caps w:val="0"/>
-          <w:smallCaps w:val="0"/>
-          <w:strike w:val="0"/>
-          <w:dstrike w:val="0"/>
-          <w:noProof w:val="0"/>
-          <w:color w:val="auto"/>
-          <w:sz w:val="32"/>
-          <w:szCs w:val="32"/>
-          <w:u w:val="none"/>
-          <w:lang w:val="en-GB"/>
-        </w:rPr>
-        <w:t xml:space="preserve"> syntax and overall general things (for example I keep writing if statements without the brackets)</w:t>
-      </w:r>
     </w:p>
     <w:p>
       <w:pPr>
@@ -165,7 +126,7 @@
           <w:u w:val="single"/>
           <w:lang w:val="en-GB"/>
         </w:rPr>
-        <w:t>How was your learning experience?</w:t>
+        <w:t>Reflection – What were my expectations?</w:t>
       </w:r>
     </w:p>
     <w:p>
@@ -207,6 +168,130 @@
           <w:u w:val="none"/>
           <w:lang w:val="en-GB"/>
         </w:rPr>
+        <w:t xml:space="preserve">To be honest I was not expecting this module to be as difficult as it was, with prior coding knowledge from other game engines I wrongfully assumed that C++ would be incredibly similar, but through the whole experience I continuously ran into </w:t>
+      </w:r>
+      <w:r>
+        <w:rPr>
+          <w:rFonts w:ascii="Aptos" w:hAnsi="Aptos" w:eastAsia="Aptos" w:cs="Aptos" w:asciiTheme="minorAscii" w:hAnsiTheme="minorAscii" w:eastAsiaTheme="minorAscii" w:cstheme="minorAscii"/>
+          <w:b w:val="0"/>
+          <w:bCs w:val="0"/>
+          <w:i w:val="0"/>
+          <w:iCs w:val="0"/>
+          <w:caps w:val="0"/>
+          <w:smallCaps w:val="0"/>
+          <w:strike w:val="0"/>
+          <w:dstrike w:val="0"/>
+          <w:noProof w:val="0"/>
+          <w:color w:val="auto"/>
+          <w:sz w:val="32"/>
+          <w:szCs w:val="32"/>
+          <w:u w:val="none"/>
+          <w:lang w:val="en-GB"/>
+        </w:rPr>
+        <w:t>problems with</w:t>
+      </w:r>
+      <w:r>
+        <w:rPr>
+          <w:rFonts w:ascii="Aptos" w:hAnsi="Aptos" w:eastAsia="Aptos" w:cs="Aptos" w:asciiTheme="minorAscii" w:hAnsiTheme="minorAscii" w:eastAsiaTheme="minorAscii" w:cstheme="minorAscii"/>
+          <w:b w:val="0"/>
+          <w:bCs w:val="0"/>
+          <w:i w:val="0"/>
+          <w:iCs w:val="0"/>
+          <w:caps w:val="0"/>
+          <w:smallCaps w:val="0"/>
+          <w:strike w:val="0"/>
+          <w:dstrike w:val="0"/>
+          <w:noProof w:val="0"/>
+          <w:color w:val="auto"/>
+          <w:sz w:val="32"/>
+          <w:szCs w:val="32"/>
+          <w:u w:val="none"/>
+          <w:lang w:val="en-GB"/>
+        </w:rPr>
+        <w:t xml:space="preserve"> syntax and overall general things (for example I keep writing if statements without the brackets)</w:t>
+      </w:r>
+    </w:p>
+    <w:p>
+      <w:pPr>
+        <w:pStyle w:val="Normal"/>
+        <w:rPr>
+          <w:rFonts w:ascii="Aptos" w:hAnsi="Aptos" w:eastAsia="Aptos" w:cs="Aptos" w:asciiTheme="minorAscii" w:hAnsiTheme="minorAscii" w:eastAsiaTheme="minorAscii" w:cstheme="minorAscii"/>
+          <w:b w:val="1"/>
+          <w:bCs w:val="1"/>
+          <w:i w:val="0"/>
+          <w:iCs w:val="0"/>
+          <w:caps w:val="0"/>
+          <w:smallCaps w:val="0"/>
+          <w:strike w:val="0"/>
+          <w:dstrike w:val="0"/>
+          <w:noProof w:val="0"/>
+          <w:color w:val="auto"/>
+          <w:sz w:val="40"/>
+          <w:szCs w:val="40"/>
+          <w:u w:val="single"/>
+          <w:lang w:val="en-GB"/>
+        </w:rPr>
+      </w:pPr>
+      <w:r>
+        <w:rPr>
+          <w:rFonts w:ascii="Aptos" w:hAnsi="Aptos" w:eastAsia="Aptos" w:cs="Aptos" w:asciiTheme="minorAscii" w:hAnsiTheme="minorAscii" w:eastAsiaTheme="minorAscii" w:cstheme="minorAscii"/>
+          <w:b w:val="1"/>
+          <w:bCs w:val="1"/>
+          <w:i w:val="0"/>
+          <w:iCs w:val="0"/>
+          <w:caps w:val="0"/>
+          <w:smallCaps w:val="0"/>
+          <w:strike w:val="0"/>
+          <w:dstrike w:val="0"/>
+          <w:noProof w:val="0"/>
+          <w:color w:val="auto"/>
+          <w:sz w:val="40"/>
+          <w:szCs w:val="40"/>
+          <w:u w:val="single"/>
+          <w:lang w:val="en-GB"/>
+        </w:rPr>
+        <w:t>How was your learning experience?</w:t>
+      </w:r>
+    </w:p>
+    <w:p>
+      <w:pPr>
+        <w:pStyle w:val="Normal"/>
+        <w:rPr>
+          <w:rFonts w:ascii="Aptos" w:hAnsi="Aptos" w:eastAsia="Aptos" w:cs="Aptos" w:asciiTheme="minorAscii" w:hAnsiTheme="minorAscii" w:eastAsiaTheme="minorAscii" w:cstheme="minorAscii"/>
+          <w:b w:val="0"/>
+          <w:bCs w:val="0"/>
+          <w:i w:val="0"/>
+          <w:iCs w:val="0"/>
+          <w:caps w:val="0"/>
+          <w:smallCaps w:val="0"/>
+          <w:strike w:val="0"/>
+          <w:dstrike w:val="0"/>
+          <w:noProof w:val="0"/>
+          <w:color w:val="auto"/>
+          <w:sz w:val="32"/>
+          <w:szCs w:val="32"/>
+          <w:u w:val="none"/>
+          <w:lang w:val="en-GB"/>
+        </w:rPr>
+      </w:pPr>
+      <w:r>
+        <w:rPr>
+          <w:rFonts w:ascii="Aptos" w:hAnsi="Aptos" w:eastAsia="Aptos" w:cs="Aptos" w:asciiTheme="minorAscii" w:hAnsiTheme="minorAscii" w:eastAsiaTheme="minorAscii" w:cstheme="minorAscii"/>
+          <w:b w:val="0"/>
+          <w:bCs w:val="0"/>
+          <w:i w:val="0"/>
+          <w:iCs w:val="0"/>
+          <w:caps w:val="0"/>
+          <w:smallCaps w:val="0"/>
+          <w:strike w:val="0"/>
+          <w:dstrike w:val="0"/>
+          <w:noProof w:val="0"/>
+          <w:color w:val="auto"/>
+          <w:sz w:val="32"/>
+          <w:szCs w:val="32"/>
+          <w:u w:val="none"/>
+          <w:lang w:val="en-GB"/>
+        </w:rPr>
         <w:t xml:space="preserve">It was quite difficult to learn C++ as </w:t>
       </w:r>
       <w:r>
@@ -267,7 +352,7 @@
           <w:u w:val="none"/>
           <w:lang w:val="en-GB"/>
         </w:rPr>
-        <w:t>actually do</w:t>
+        <w:t>do</w:t>
       </w:r>
       <w:r>
         <w:rPr>
@@ -1587,6 +1672,9 @@
 <file path=word/intelligence2.xml><?xml version="1.0" encoding="utf-8"?>
 <int2:intelligence xmlns:int2="http://schemas.microsoft.com/office/intelligence/2020/intelligence">
   <int2:observations>
+    <int2:textHash int2:hashCode="N/534C6bUVzGXs" int2:id="8nguIUkG">
+      <int2:state int2:type="spell" int2:value="Rejected"/>
+    </int2:textHash>
     <int2:textHash int2:hashCode="Tq29WCLnMeaupM" int2:id="CHXkNTx7">
       <int2:state int2:type="spell" int2:value="Rejected"/>
     </int2:textHash>
@@ -2016,6 +2104,17 @@
     <w:semiHidden/>
     <w:unhideWhenUsed/>
   </w:style>
+  <w:style w:type="character" w:styleId="Hyperlink">
+    <w:uiPriority w:val="99"/>
+    <w:name w:val="Hyperlink"/>
+    <w:basedOn w:val="DefaultParagraphFont"/>
+    <w:unhideWhenUsed/>
+    <w:rsid w:val="2B2DB2F9"/>
+    <w:rPr>
+      <w:color w:val="467886"/>
+      <w:u w:val="single"/>
+    </w:rPr>
+  </w:style>
 </w:styles>
 </file>
 

</xml_diff>